<commit_message>
Módulo de préstamos funcionando y sincronizado con Alembic
</commit_message>
<xml_diff>
--- a/docs/SIGIO_Documento_Maestro_Edicion_Institucional V 1.0.docx
+++ b/docs/SIGIO_Documento_Maestro_Edicion_Institucional V 1.0.docx
@@ -1513,7 +1513,13 @@
         <w:rPr>
           <w:sz w:val="20"/>
         </w:rPr>
-        <w:t xml:space="preserve">                 DONACIÓN</w:t>
+        <w:t xml:space="preserve">                 </w:t>
+      </w:r>
+      <w:r>
+        <w:rPr>
+          <w:sz w:val="20"/>
+        </w:rPr>
+        <w:t>ADQUISICIÓN</w:t>
       </w:r>
     </w:p>
     <w:p>
@@ -4803,7 +4809,13 @@
         <w:rPr>
           <w:sz w:val="20"/>
         </w:rPr>
-        <w:t xml:space="preserve">                    DONACIÓN</w:t>
+        <w:t xml:space="preserve">                    </w:t>
+      </w:r>
+      <w:r>
+        <w:rPr>
+          <w:sz w:val="20"/>
+        </w:rPr>
+        <w:t>ADQUISICIÓN</w:t>
       </w:r>
     </w:p>
     <w:p>

</xml_diff>